<commit_message>
add travel expenses calculator
</commit_message>
<xml_diff>
--- a/src/data/Spesenabrechnung_Vorlage.docx
+++ b/src/data/Spesenabrechnung_Vorlage.docx
@@ -1576,6 +1576,24 @@
                 <w:rFonts w:cs="Arial"/>
               </w:rPr>
             </w:pPr>
+            <w:r>
+              <w:rPr>
+                <w:rFonts w:cs="Arial"/>
+              </w:rPr>
+              <w:t>{{SR_</w:t>
+            </w:r>
+            <w:r>
+              <w:rPr>
+                <w:rFonts w:cs="Arial"/>
+              </w:rPr>
+              <w:t>Kilometer</w:t>
+            </w:r>
+            <w:r>
+              <w:rPr>
+                <w:rFonts w:cs="Arial"/>
+              </w:rPr>
+              <w:t>}}</w:t>
+            </w:r>
           </w:p>
         </w:tc>
         <w:tc>
@@ -1591,6 +1609,36 @@
                 <w:rFonts w:cs="Arial"/>
               </w:rPr>
             </w:pPr>
+            <w:r>
+              <w:rPr>
+                <w:rFonts w:cs="Arial"/>
+              </w:rPr>
+              <w:t>{{SR</w:t>
+            </w:r>
+            <w:r>
+              <w:rPr>
+                <w:rFonts w:cs="Arial"/>
+              </w:rPr>
+              <w:t>A1</w:t>
+            </w:r>
+            <w:r>
+              <w:rPr>
+                <w:rFonts w:cs="Arial"/>
+              </w:rPr>
+              <w:t>_</w:t>
+            </w:r>
+            <w:r>
+              <w:rPr>
+                <w:rFonts w:cs="Arial"/>
+              </w:rPr>
+              <w:t>Kilometer</w:t>
+            </w:r>
+            <w:r>
+              <w:rPr>
+                <w:rFonts w:cs="Arial"/>
+              </w:rPr>
+              <w:t>}}</w:t>
+            </w:r>
           </w:p>
         </w:tc>
         <w:tc>
@@ -1605,6 +1653,36 @@
                 <w:rFonts w:cs="Arial"/>
               </w:rPr>
             </w:pPr>
+            <w:r>
+              <w:rPr>
+                <w:rFonts w:cs="Arial"/>
+              </w:rPr>
+              <w:t>{{SR</w:t>
+            </w:r>
+            <w:r>
+              <w:rPr>
+                <w:rFonts w:cs="Arial"/>
+              </w:rPr>
+              <w:t>A2</w:t>
+            </w:r>
+            <w:r>
+              <w:rPr>
+                <w:rFonts w:cs="Arial"/>
+              </w:rPr>
+              <w:t>_</w:t>
+            </w:r>
+            <w:r>
+              <w:rPr>
+                <w:rFonts w:cs="Arial"/>
+              </w:rPr>
+              <w:t>Kilometer</w:t>
+            </w:r>
+            <w:r>
+              <w:rPr>
+                <w:rFonts w:cs="Arial"/>
+              </w:rPr>
+              <w:t>}}</w:t>
+            </w:r>
           </w:p>
         </w:tc>
       </w:tr>
@@ -1646,6 +1724,24 @@
                 <w:rFonts w:cs="Arial"/>
               </w:rPr>
             </w:pPr>
+            <w:r>
+              <w:rPr>
+                <w:rFonts w:cs="Arial"/>
+              </w:rPr>
+              <w:t>{{SR_</w:t>
+            </w:r>
+            <w:r>
+              <w:rPr>
+                <w:rFonts w:cs="Arial"/>
+              </w:rPr>
+              <w:t>OEVM</w:t>
+            </w:r>
+            <w:r>
+              <w:rPr>
+                <w:rFonts w:cs="Arial"/>
+              </w:rPr>
+              <w:t>}}</w:t>
+            </w:r>
           </w:p>
         </w:tc>
         <w:tc>
@@ -1661,6 +1757,36 @@
                 <w:rFonts w:cs="Arial"/>
               </w:rPr>
             </w:pPr>
+            <w:r>
+              <w:rPr>
+                <w:rFonts w:cs="Arial"/>
+              </w:rPr>
+              <w:t>{{SR</w:t>
+            </w:r>
+            <w:r>
+              <w:rPr>
+                <w:rFonts w:cs="Arial"/>
+              </w:rPr>
+              <w:t>A1</w:t>
+            </w:r>
+            <w:r>
+              <w:rPr>
+                <w:rFonts w:cs="Arial"/>
+              </w:rPr>
+              <w:t>_</w:t>
+            </w:r>
+            <w:r>
+              <w:rPr>
+                <w:rFonts w:cs="Arial"/>
+              </w:rPr>
+              <w:t>OEVM</w:t>
+            </w:r>
+            <w:r>
+              <w:rPr>
+                <w:rFonts w:cs="Arial"/>
+              </w:rPr>
+              <w:t>}}</w:t>
+            </w:r>
           </w:p>
         </w:tc>
         <w:tc>
@@ -1675,6 +1801,36 @@
                 <w:rFonts w:cs="Arial"/>
               </w:rPr>
             </w:pPr>
+            <w:r>
+              <w:rPr>
+                <w:rFonts w:cs="Arial"/>
+              </w:rPr>
+              <w:t>{{SR</w:t>
+            </w:r>
+            <w:r>
+              <w:rPr>
+                <w:rFonts w:cs="Arial"/>
+              </w:rPr>
+              <w:t>A2</w:t>
+            </w:r>
+            <w:r>
+              <w:rPr>
+                <w:rFonts w:cs="Arial"/>
+              </w:rPr>
+              <w:t>_</w:t>
+            </w:r>
+            <w:r>
+              <w:rPr>
+                <w:rFonts w:cs="Arial"/>
+              </w:rPr>
+              <w:t>OEVM</w:t>
+            </w:r>
+            <w:r>
+              <w:rPr>
+                <w:rFonts w:cs="Arial"/>
+              </w:rPr>
+              <w:t>}}</w:t>
+            </w:r>
           </w:p>
         </w:tc>
       </w:tr>
@@ -1996,6 +2152,12 @@
                 <w:rFonts w:cs="Arial"/>
               </w:rPr>
             </w:pPr>
+            <w:r>
+              <w:rPr>
+                <w:rFonts w:cs="Arial"/>
+              </w:rPr>
+              <w:t>{{SR_Summe}}</w:t>
+            </w:r>
           </w:p>
         </w:tc>
         <w:tc>
@@ -2011,6 +2173,24 @@
                 <w:rFonts w:cs="Arial"/>
               </w:rPr>
             </w:pPr>
+            <w:r>
+              <w:rPr>
+                <w:rFonts w:cs="Arial"/>
+              </w:rPr>
+              <w:t>{{SR</w:t>
+            </w:r>
+            <w:r>
+              <w:rPr>
+                <w:rFonts w:cs="Arial"/>
+              </w:rPr>
+              <w:t>A1</w:t>
+            </w:r>
+            <w:r>
+              <w:rPr>
+                <w:rFonts w:cs="Arial"/>
+              </w:rPr>
+              <w:t>_Summe}}</w:t>
+            </w:r>
           </w:p>
         </w:tc>
         <w:tc>
@@ -2028,6 +2208,24 @@
                 <w:rFonts w:cs="Arial"/>
               </w:rPr>
             </w:pPr>
+            <w:r>
+              <w:rPr>
+                <w:rFonts w:cs="Arial"/>
+              </w:rPr>
+              <w:t>{{SR</w:t>
+            </w:r>
+            <w:r>
+              <w:rPr>
+                <w:rFonts w:cs="Arial"/>
+              </w:rPr>
+              <w:t>A2</w:t>
+            </w:r>
+            <w:r>
+              <w:rPr>
+                <w:rFonts w:cs="Arial"/>
+              </w:rPr>
+              <w:t>_Summe}}</w:t>
+            </w:r>
           </w:p>
         </w:tc>
       </w:tr>
@@ -2079,6 +2277,12 @@
                 <w:b/>
               </w:rPr>
             </w:pPr>
+            <w:r>
+              <w:rPr>
+                <w:rFonts w:cs="Arial"/>
+              </w:rPr>
+              <w:t>{{Summe}}</w:t>
+            </w:r>
           </w:p>
         </w:tc>
       </w:tr>
@@ -2301,7 +2505,7 @@
       <w:rPr>
         <w:noProof/>
       </w:rPr>
-      <w:pict w14:anchorId="1ADDAD21">
+      <w:pict w14:anchorId="1641A9A7">
         <v:shapetype id="_x0000_t75" coordsize="21600,21600" o:spt="75" o:preferrelative="t" path="m@4@5l@4@11@9@11@9@5xe" filled="f" stroked="f">
           <v:stroke joinstyle="miter"/>
           <v:formulas>
@@ -2899,7 +3103,6 @@
   <w:style w:type="character" w:default="1" w:styleId="Absatz-Standardschriftart">
     <w:name w:val="Default Paragraph Font"/>
     <w:uiPriority w:val="1"/>
-    <w:semiHidden/>
     <w:unhideWhenUsed/>
   </w:style>
   <w:style w:type="table" w:default="1" w:styleId="NormaleTabelle">

</xml_diff>